<commit_message>
update template + pic
</commit_message>
<xml_diff>
--- a/templates/บันทึกออกตรวจงานจ้าง_template.docx
+++ b/templates/บันทึกออกตรวจงานจ้าง_template.docx
@@ -39,7 +39,7 @@
             <v:imagedata r:id="rId6" o:title="" blacklevel="3932f" o:detectmouseclick="f"/>
             <w10:wrap anchory="page"/>
           </v:shape>
-          <o:OLEObject Type="Embed" ProgID="Word.Picture.8" ShapeID="Picture 1" DrawAspect="Content" ObjectID="_1851679665" r:id="rId7"/>
+          <o:OLEObject Type="Embed" ProgID="Word.Picture.8" ShapeID="Picture 1" DrawAspect="Content" ObjectID="_1851745322" r:id="rId7"/>
         </w:object>
       </w:r>
       <w:r>
@@ -899,7 +899,6 @@
     <w:p>
       <w:pPr>
         <w:widowControl w:val="0"/>
-        <w:spacing w:before="120"/>
         <w:ind w:firstLine="720"/>
         <w:rPr>
           <w:rFonts w:ascii="TH SarabunIT๙" w:hAnsi="TH SarabunIT๙" w:cs="TH SarabunIT๙"/>
@@ -1033,9 +1032,7 @@
     <w:p>
       <w:pPr>
         <w:widowControl w:val="0"/>
-        <w:spacing w:before="120"/>
         <w:ind w:firstLine="720"/>
-        <w:jc w:val="thaiDistribute"/>
         <w:rPr>
           <w:rFonts w:ascii="TH SarabunIT๙" w:hAnsi="TH SarabunIT๙" w:cs="TH SarabunIT๙"/>
           <w:b/>
@@ -1318,7 +1315,6 @@
     <w:p>
       <w:pPr>
         <w:widowControl w:val="0"/>
-        <w:spacing w:before="120"/>
         <w:ind w:firstLine="720"/>
         <w:rPr>
           <w:rFonts w:ascii="TH SarabunIT๙" w:hAnsi="TH SarabunIT๙" w:cs="TH SarabunIT๙"/>
@@ -1500,7 +1496,7 @@
         <w:widowControl w:val="0"/>
         <w:spacing w:before="120"/>
         <w:rPr>
-          <w:rFonts w:ascii="TH SarabunIT๙" w:hAnsi="TH SarabunIT๙" w:cs="TH SarabunIT๙" w:hint="cs"/>
+          <w:rFonts w:ascii="TH SarabunIT๙" w:hAnsi="TH SarabunIT๙" w:cs="TH SarabunIT๙"/>
           <w:color w:val="000000"/>
           <w:sz w:val="32"/>
           <w:szCs w:val="32"/>
@@ -2133,20 +2129,6 @@
         <w:jc w:val="center"/>
         <w:rPr>
           <w:rFonts w:ascii="TH SarabunIT๙" w:hAnsi="TH SarabunIT๙" w:cs="TH SarabunIT๙"/>
-          <w:snapToGrid w:val="0"/>
-          <w:sz w:val="20"/>
-          <w:szCs w:val="20"/>
-          <w:lang w:eastAsia="th-TH"/>
-        </w:rPr>
-      </w:pPr>
-    </w:p>
-    <w:p>
-      <w:pPr>
-        <w:widowControl w:val="0"/>
-        <w:spacing w:before="120"/>
-        <w:jc w:val="center"/>
-        <w:rPr>
-          <w:rFonts w:ascii="TH SarabunIT๙" w:hAnsi="TH SarabunIT๙" w:cs="TH SarabunIT๙"/>
           <w:b/>
           <w:bCs/>
           <w:snapToGrid w:val="0"/>
@@ -2166,6 +2148,7 @@
           <w:cs/>
           <w:lang w:eastAsia="th-TH"/>
         </w:rPr>
+        <w:lastRenderedPageBreak/>
         <w:t>บันทึกผลการตรวจงานจ้าง</w:t>
       </w:r>
     </w:p>
@@ -3013,20 +2996,7 @@
         <w:widowControl w:val="0"/>
         <w:spacing w:before="120"/>
         <w:rPr>
-          <w:rFonts w:ascii="TH SarabunIT๙" w:hAnsi="TH SarabunIT๙" w:cs="TH SarabunIT๙"/>
-          <w:snapToGrid w:val="0"/>
-          <w:sz w:val="32"/>
-          <w:szCs w:val="32"/>
-          <w:lang w:eastAsia="th-TH"/>
-        </w:rPr>
-      </w:pPr>
-    </w:p>
-    <w:p>
-      <w:pPr>
-        <w:widowControl w:val="0"/>
-        <w:spacing w:before="120"/>
-        <w:rPr>
-          <w:rFonts w:ascii="TH SarabunIT๙" w:hAnsi="TH SarabunIT๙" w:cs="TH SarabunIT๙"/>
+          <w:rFonts w:ascii="TH SarabunIT๙" w:hAnsi="TH SarabunIT๙" w:cs="TH SarabunIT๙" w:hint="cs"/>
           <w:snapToGrid w:val="0"/>
           <w:sz w:val="32"/>
           <w:szCs w:val="32"/>
@@ -3400,7 +3370,7 @@
         <w:widowControl w:val="0"/>
         <w:spacing w:before="120"/>
         <w:rPr>
-          <w:rFonts w:ascii="TH SarabunIT๙" w:hAnsi="TH SarabunIT๙" w:cs="TH SarabunIT๙"/>
+          <w:rFonts w:ascii="TH SarabunIT๙" w:hAnsi="TH SarabunIT๙" w:cs="TH SarabunIT๙" w:hint="cs"/>
           <w:snapToGrid w:val="0"/>
           <w:sz w:val="32"/>
           <w:szCs w:val="32"/>

</xml_diff>